<commit_message>
Final version: Edrak features and SRS v1.5
</commit_message>
<xml_diff>
--- a/docs/QuoteIt_SRS.docx
+++ b/docs/QuoteIt_SRS.docx
@@ -8,7 +8,7 @@
         <w:spacing w:after="80"/>
       </w:pPr>
       <w:r>
-        <w:t>QuoteIt</w:t>
+        <w:t>Edrak!</w:t>
       </w:r>
     </w:p>
     <w:p>
@@ -40,7 +40,7 @@
         <w:rPr>
           <w:color w:val="808080"/>
         </w:rPr>
-        <w:t>Version 1.2 · October 2026</w:t>
+        <w:t>Version 1.5 · October 2026</w:t>
       </w:r>
     </w:p>
     <w:p>
@@ -57,7 +57,7 @@
         <w:spacing w:after="120"/>
       </w:pPr>
       <w:r>
-        <w:t>QuoteIt is a simple website where anyone can read quotes shared by others, and registered users can share their own quotes and edit or delete them. This SRS describes the version that was built and is the team's reference for the next stages.</w:t>
+        <w:t>Edrak! (code name QuoteIt) is a website where anyone can read quotes shared by others, and registered users can share quotes with a mood and like, edit, or delete them. This SRS describes the final version that was built, including the added features (likes, mood compass, Insight of the Day, quote cards, and calm session), and is the team's reference for the next stages.</w:t>
       </w:r>
     </w:p>
     <w:p>
@@ -82,7 +82,7 @@
         <w:spacing w:after="120"/>
       </w:pPr>
       <w:r>
-        <w:t>QuoteIt gives everyone one place to browse quotes, and lets registered users share their own and keep them up to date.</w:t>
+        <w:t>Edrak! gives everyone one place to browse quotes by mood, and lets registered users share their own and keep them up to date.</w:t>
       </w:r>
     </w:p>
     <w:p>
@@ -446,6 +446,266 @@
           <w:p>
             <w:r>
               <w:t>Direct messages between users</w:t>
+            </w:r>
+          </w:p>
+        </w:tc>
+      </w:tr>
+      <w:tr>
+        <w:tblPrEx>
+          <w:tblCellMar>
+            <w:top w:w="0" w:type="dxa"/>
+            <w:bottom w:w="0" w:type="dxa"/>
+          </w:tblCellMar>
+        </w:tblPrEx>
+        <w:tc>
+          <w:tcPr>
+            <w:tcW w:w="4513" w:type="dxa"/>
+            <w:tcBorders>
+              <w:top w:val="single" w:sz="4" w:space="0" w:color="BFBFBF"/>
+              <w:left w:val="single" w:sz="4" w:space="0" w:color="BFBFBF"/>
+              <w:bottom w:val="single" w:sz="4" w:space="0" w:color="BFBFBF"/>
+              <w:right w:val="single" w:sz="4" w:space="0" w:color="BFBFBF"/>
+            </w:tcBorders>
+            <w:tcMar>
+              <w:top w:w="60" w:type="dxa"/>
+              <w:left w:w="100" w:type="dxa"/>
+              <w:bottom w:w="60" w:type="dxa"/>
+              <w:right w:w="100" w:type="dxa"/>
+            </w:tcMar>
+          </w:tcPr>
+          <w:p>
+            <w:r>
+              <w:t>Like and unlike a quote</w:t>
+            </w:r>
+          </w:p>
+        </w:tc>
+        <w:tc>
+          <w:tcPr>
+            <w:tcW w:w="4513" w:type="dxa"/>
+            <w:tcBorders>
+              <w:top w:val="single" w:sz="4" w:space="0" w:color="BFBFBF"/>
+              <w:left w:val="single" w:sz="4" w:space="0" w:color="BFBFBF"/>
+              <w:bottom w:val="single" w:sz="4" w:space="0" w:color="BFBFBF"/>
+              <w:right w:val="single" w:sz="4" w:space="0" w:color="BFBFBF"/>
+            </w:tcBorders>
+            <w:tcMar>
+              <w:top w:w="60" w:type="dxa"/>
+              <w:left w:w="100" w:type="dxa"/>
+              <w:bottom w:w="60" w:type="dxa"/>
+              <w:right w:w="100" w:type="dxa"/>
+            </w:tcMar>
+          </w:tcPr>
+          <w:p>
+            <w:r>
+              <w:t>Searching quotes by keyword or meaning</w:t>
+            </w:r>
+          </w:p>
+        </w:tc>
+      </w:tr>
+      <w:tr>
+        <w:tblPrEx>
+          <w:tblCellMar>
+            <w:top w:w="0" w:type="dxa"/>
+            <w:bottom w:w="0" w:type="dxa"/>
+          </w:tblCellMar>
+        </w:tblPrEx>
+        <w:tc>
+          <w:tcPr>
+            <w:tcW w:w="4513" w:type="dxa"/>
+            <w:tcBorders>
+              <w:top w:val="single" w:sz="4" w:space="0" w:color="BFBFBF"/>
+              <w:left w:val="single" w:sz="4" w:space="0" w:color="BFBFBF"/>
+              <w:bottom w:val="single" w:sz="4" w:space="0" w:color="BFBFBF"/>
+              <w:right w:val="single" w:sz="4" w:space="0" w:color="BFBFBF"/>
+            </w:tcBorders>
+            <w:tcMar>
+              <w:top w:w="60" w:type="dxa"/>
+              <w:left w:w="100" w:type="dxa"/>
+              <w:bottom w:w="60" w:type="dxa"/>
+              <w:right w:w="100" w:type="dxa"/>
+            </w:tcMar>
+          </w:tcPr>
+          <w:p>
+            <w:r>
+              <w:t>Choose a mood for a quote and filter quotes by mood</w:t>
+            </w:r>
+          </w:p>
+        </w:tc>
+        <w:tc>
+          <w:tcPr>
+            <w:tcW w:w="4513" w:type="dxa"/>
+            <w:tcBorders>
+              <w:top w:val="single" w:sz="4" w:space="0" w:color="BFBFBF"/>
+              <w:left w:val="single" w:sz="4" w:space="0" w:color="BFBFBF"/>
+              <w:bottom w:val="single" w:sz="4" w:space="0" w:color="BFBFBF"/>
+              <w:right w:val="single" w:sz="4" w:space="0" w:color="BFBFBF"/>
+            </w:tcBorders>
+            <w:tcMar>
+              <w:top w:w="60" w:type="dxa"/>
+              <w:left w:w="100" w:type="dxa"/>
+              <w:bottom w:w="60" w:type="dxa"/>
+              <w:right w:w="100" w:type="dxa"/>
+            </w:tcMar>
+          </w:tcPr>
+          <w:p>
+            <w:r>
+              <w:t>AI analysis of quotes (tags and tone)</w:t>
+            </w:r>
+          </w:p>
+        </w:tc>
+      </w:tr>
+      <w:tr>
+        <w:tblPrEx>
+          <w:tblCellMar>
+            <w:top w:w="0" w:type="dxa"/>
+            <w:bottom w:w="0" w:type="dxa"/>
+          </w:tblCellMar>
+        </w:tblPrEx>
+        <w:tc>
+          <w:tcPr>
+            <w:tcW w:w="4513" w:type="dxa"/>
+            <w:tcBorders>
+              <w:top w:val="single" w:sz="4" w:space="0" w:color="BFBFBF"/>
+              <w:left w:val="single" w:sz="4" w:space="0" w:color="BFBFBF"/>
+              <w:bottom w:val="single" w:sz="4" w:space="0" w:color="BFBFBF"/>
+              <w:right w:val="single" w:sz="4" w:space="0" w:color="BFBFBF"/>
+            </w:tcBorders>
+            <w:tcMar>
+              <w:top w:w="60" w:type="dxa"/>
+              <w:left w:w="100" w:type="dxa"/>
+              <w:bottom w:w="60" w:type="dxa"/>
+              <w:right w:w="100" w:type="dxa"/>
+            </w:tcMar>
+          </w:tcPr>
+          <w:p>
+            <w:r>
+              <w:t>Insight of the Day</w:t>
+            </w:r>
+          </w:p>
+        </w:tc>
+        <w:tc>
+          <w:tcPr>
+            <w:tcW w:w="4513" w:type="dxa"/>
+            <w:tcBorders>
+              <w:top w:val="single" w:sz="4" w:space="0" w:color="BFBFBF"/>
+              <w:left w:val="single" w:sz="4" w:space="0" w:color="BFBFBF"/>
+              <w:bottom w:val="single" w:sz="4" w:space="0" w:color="BFBFBF"/>
+              <w:right w:val="single" w:sz="4" w:space="0" w:color="BFBFBF"/>
+            </w:tcBorders>
+            <w:tcMar>
+              <w:top w:w="60" w:type="dxa"/>
+              <w:left w:w="100" w:type="dxa"/>
+              <w:bottom w:w="60" w:type="dxa"/>
+              <w:right w:w="100" w:type="dxa"/>
+            </w:tcMar>
+          </w:tcPr>
+          <w:p>
+            <w:r>
+              <w:t>A bookshelf linking quotes to books</w:t>
+            </w:r>
+          </w:p>
+        </w:tc>
+      </w:tr>
+      <w:tr>
+        <w:tblPrEx>
+          <w:tblCellMar>
+            <w:top w:w="0" w:type="dxa"/>
+            <w:bottom w:w="0" w:type="dxa"/>
+          </w:tblCellMar>
+        </w:tblPrEx>
+        <w:tc>
+          <w:tcPr>
+            <w:tcW w:w="4513" w:type="dxa"/>
+            <w:tcBorders>
+              <w:top w:val="single" w:sz="4" w:space="0" w:color="BFBFBF"/>
+              <w:left w:val="single" w:sz="4" w:space="0" w:color="BFBFBF"/>
+              <w:bottom w:val="single" w:sz="4" w:space="0" w:color="BFBFBF"/>
+              <w:right w:val="single" w:sz="4" w:space="0" w:color="BFBFBF"/>
+            </w:tcBorders>
+            <w:tcMar>
+              <w:top w:w="60" w:type="dxa"/>
+              <w:left w:w="100" w:type="dxa"/>
+              <w:bottom w:w="60" w:type="dxa"/>
+              <w:right w:w="100" w:type="dxa"/>
+            </w:tcMar>
+          </w:tcPr>
+          <w:p>
+            <w:r>
+              <w:t>Turn a quote into a downloadable image card</w:t>
+            </w:r>
+          </w:p>
+        </w:tc>
+        <w:tc>
+          <w:tcPr>
+            <w:tcW w:w="4513" w:type="dxa"/>
+            <w:tcBorders>
+              <w:top w:val="single" w:sz="4" w:space="0" w:color="BFBFBF"/>
+              <w:left w:val="single" w:sz="4" w:space="0" w:color="BFBFBF"/>
+              <w:bottom w:val="single" w:sz="4" w:space="0" w:color="BFBFBF"/>
+              <w:right w:val="single" w:sz="4" w:space="0" w:color="BFBFBF"/>
+            </w:tcBorders>
+            <w:tcMar>
+              <w:top w:w="60" w:type="dxa"/>
+              <w:left w:w="100" w:type="dxa"/>
+              <w:bottom w:w="60" w:type="dxa"/>
+              <w:right w:w="100" w:type="dxa"/>
+            </w:tcMar>
+          </w:tcPr>
+          <w:p>
+            <w:r>
+              <w:t>A page of personally saved quotes</w:t>
+            </w:r>
+          </w:p>
+        </w:tc>
+      </w:tr>
+      <w:tr>
+        <w:tblPrEx>
+          <w:tblCellMar>
+            <w:top w:w="0" w:type="dxa"/>
+            <w:bottom w:w="0" w:type="dxa"/>
+          </w:tblCellMar>
+        </w:tblPrEx>
+        <w:tc>
+          <w:tcPr>
+            <w:tcW w:w="4513" w:type="dxa"/>
+            <w:tcBorders>
+              <w:top w:val="single" w:sz="4" w:space="0" w:color="BFBFBF"/>
+              <w:left w:val="single" w:sz="4" w:space="0" w:color="BFBFBF"/>
+              <w:bottom w:val="single" w:sz="4" w:space="0" w:color="BFBFBF"/>
+              <w:right w:val="single" w:sz="4" w:space="0" w:color="BFBFBF"/>
+            </w:tcBorders>
+            <w:tcMar>
+              <w:top w:w="60" w:type="dxa"/>
+              <w:left w:w="100" w:type="dxa"/>
+              <w:bottom w:w="60" w:type="dxa"/>
+              <w:right w:w="100" w:type="dxa"/>
+            </w:tcMar>
+          </w:tcPr>
+          <w:p>
+            <w:r>
+              <w:t>Calm session (full-screen quotes)</w:t>
+            </w:r>
+          </w:p>
+        </w:tc>
+        <w:tc>
+          <w:tcPr>
+            <w:tcW w:w="4513" w:type="dxa"/>
+            <w:tcBorders>
+              <w:top w:val="single" w:sz="4" w:space="0" w:color="BFBFBF"/>
+              <w:left w:val="single" w:sz="4" w:space="0" w:color="BFBFBF"/>
+              <w:bottom w:val="single" w:sz="4" w:space="0" w:color="BFBFBF"/>
+              <w:right w:val="single" w:sz="4" w:space="0" w:color="BFBFBF"/>
+            </w:tcBorders>
+            <w:tcMar>
+              <w:top w:w="60" w:type="dxa"/>
+              <w:left w:w="100" w:type="dxa"/>
+              <w:bottom w:w="60" w:type="dxa"/>
+              <w:right w:w="100" w:type="dxa"/>
+            </w:tcMar>
+          </w:tcPr>
+          <w:p>
+            <w:r>
+              <w:t>A mobile app</w:t>
             </w:r>
           </w:p>
         </w:tc>
@@ -654,7 +914,7 @@
           </w:tcPr>
           <w:p>
             <w:r>
-              <w:t>Read all shared quotes; sign up or log in</w:t>
+              <w:t>Read all shared quotes, filter them by mood, make quote cards; sign up or log in</w:t>
             </w:r>
           </w:p>
         </w:tc>
@@ -728,7 +988,7 @@
           </w:tcPr>
           <w:p>
             <w:r>
-              <w:t>Read all quotes; share, edit, and delete their own quotes</w:t>
+              <w:t>Read all quotes; share (with a mood), like, edit, and delete their own quotes</w:t>
             </w:r>
           </w:p>
         </w:tc>
@@ -916,7 +1176,7 @@
           </w:tcPr>
           <w:p>
             <w:r>
-              <w:t>The system shall show all users' quotes to anyone, including guests, with the quote text, the name of who shared it, and the date.</w:t>
+              <w:t>The system shall show all users' quotes to anyone, including guests, with the quote text, the name of who shared it, the date, its mood, and the number of likes.</w:t>
             </w:r>
           </w:p>
         </w:tc>
@@ -1212,7 +1472,7 @@
           </w:tcPr>
           <w:p>
             <w:r>
-              <w:t>The system shall let a logged-in user share a quote of 3 to 155 characters.</w:t>
+              <w:t>The system shall let a logged-in user share a quote of 3 to 155 characters and choose one mood for it (Hope, Calm, Philosophy, or Motivation).</w:t>
             </w:r>
           </w:p>
         </w:tc>
@@ -1383,6 +1643,450 @@
           <w:p>
             <w:r>
               <w:t>Must</w:t>
+            </w:r>
+          </w:p>
+        </w:tc>
+      </w:tr>
+      <w:tr>
+        <w:tblPrEx>
+          <w:tblCellMar>
+            <w:top w:w="0" w:type="dxa"/>
+            <w:bottom w:w="0" w:type="dxa"/>
+          </w:tblCellMar>
+        </w:tblPrEx>
+        <w:tc>
+          <w:tcPr>
+            <w:tcW w:w="1100" w:type="dxa"/>
+            <w:tcBorders>
+              <w:top w:val="single" w:sz="4" w:space="0" w:color="BFBFBF"/>
+              <w:left w:val="single" w:sz="4" w:space="0" w:color="BFBFBF"/>
+              <w:bottom w:val="single" w:sz="4" w:space="0" w:color="BFBFBF"/>
+              <w:right w:val="single" w:sz="4" w:space="0" w:color="BFBFBF"/>
+            </w:tcBorders>
+            <w:tcMar>
+              <w:top w:w="60" w:type="dxa"/>
+              <w:left w:w="100" w:type="dxa"/>
+              <w:bottom w:w="60" w:type="dxa"/>
+              <w:right w:w="100" w:type="dxa"/>
+            </w:tcMar>
+          </w:tcPr>
+          <w:p>
+            <w:r>
+              <w:t>FR-08</w:t>
+            </w:r>
+          </w:p>
+        </w:tc>
+        <w:tc>
+          <w:tcPr>
+            <w:tcW w:w="6526" w:type="dxa"/>
+            <w:tcBorders>
+              <w:top w:val="single" w:sz="4" w:space="0" w:color="BFBFBF"/>
+              <w:left w:val="single" w:sz="4" w:space="0" w:color="BFBFBF"/>
+              <w:bottom w:val="single" w:sz="4" w:space="0" w:color="BFBFBF"/>
+              <w:right w:val="single" w:sz="4" w:space="0" w:color="BFBFBF"/>
+            </w:tcBorders>
+            <w:tcMar>
+              <w:top w:w="60" w:type="dxa"/>
+              <w:left w:w="100" w:type="dxa"/>
+              <w:bottom w:w="60" w:type="dxa"/>
+              <w:right w:w="100" w:type="dxa"/>
+            </w:tcMar>
+          </w:tcPr>
+          <w:p>
+            <w:r>
+              <w:t>The system shall let a logged-in user like any quote, and press again to remove their like. A user can like a quote only once.</w:t>
+            </w:r>
+          </w:p>
+        </w:tc>
+        <w:tc>
+          <w:tcPr>
+            <w:tcW w:w="1400" w:type="dxa"/>
+            <w:tcBorders>
+              <w:top w:val="single" w:sz="4" w:space="0" w:color="BFBFBF"/>
+              <w:left w:val="single" w:sz="4" w:space="0" w:color="BFBFBF"/>
+              <w:bottom w:val="single" w:sz="4" w:space="0" w:color="BFBFBF"/>
+              <w:right w:val="single" w:sz="4" w:space="0" w:color="BFBFBF"/>
+            </w:tcBorders>
+            <w:tcMar>
+              <w:top w:w="60" w:type="dxa"/>
+              <w:left w:w="100" w:type="dxa"/>
+              <w:bottom w:w="60" w:type="dxa"/>
+              <w:right w:w="100" w:type="dxa"/>
+            </w:tcMar>
+          </w:tcPr>
+          <w:p>
+            <w:r>
+              <w:t>Should</w:t>
+            </w:r>
+          </w:p>
+        </w:tc>
+      </w:tr>
+      <w:tr>
+        <w:tblPrEx>
+          <w:tblCellMar>
+            <w:top w:w="0" w:type="dxa"/>
+            <w:bottom w:w="0" w:type="dxa"/>
+          </w:tblCellMar>
+        </w:tblPrEx>
+        <w:tc>
+          <w:tcPr>
+            <w:tcW w:w="1100" w:type="dxa"/>
+            <w:tcBorders>
+              <w:top w:val="single" w:sz="4" w:space="0" w:color="BFBFBF"/>
+              <w:left w:val="single" w:sz="4" w:space="0" w:color="BFBFBF"/>
+              <w:bottom w:val="single" w:sz="4" w:space="0" w:color="BFBFBF"/>
+              <w:right w:val="single" w:sz="4" w:space="0" w:color="BFBFBF"/>
+            </w:tcBorders>
+            <w:tcMar>
+              <w:top w:w="60" w:type="dxa"/>
+              <w:left w:w="100" w:type="dxa"/>
+              <w:bottom w:w="60" w:type="dxa"/>
+              <w:right w:w="100" w:type="dxa"/>
+            </w:tcMar>
+          </w:tcPr>
+          <w:p>
+            <w:r>
+              <w:t>FR-09</w:t>
+            </w:r>
+          </w:p>
+        </w:tc>
+        <w:tc>
+          <w:tcPr>
+            <w:tcW w:w="6526" w:type="dxa"/>
+            <w:tcBorders>
+              <w:top w:val="single" w:sz="4" w:space="0" w:color="BFBFBF"/>
+              <w:left w:val="single" w:sz="4" w:space="0" w:color="BFBFBF"/>
+              <w:bottom w:val="single" w:sz="4" w:space="0" w:color="BFBFBF"/>
+              <w:right w:val="single" w:sz="4" w:space="0" w:color="BFBFBF"/>
+            </w:tcBorders>
+            <w:tcMar>
+              <w:top w:w="60" w:type="dxa"/>
+              <w:left w:w="100" w:type="dxa"/>
+              <w:bottom w:w="60" w:type="dxa"/>
+              <w:right w:w="100" w:type="dxa"/>
+            </w:tcMar>
+          </w:tcPr>
+          <w:p>
+            <w:r>
+              <w:t>The system shall show the number of likes on every quote to anyone, including guests.</w:t>
+            </w:r>
+          </w:p>
+        </w:tc>
+        <w:tc>
+          <w:tcPr>
+            <w:tcW w:w="1400" w:type="dxa"/>
+            <w:tcBorders>
+              <w:top w:val="single" w:sz="4" w:space="0" w:color="BFBFBF"/>
+              <w:left w:val="single" w:sz="4" w:space="0" w:color="BFBFBF"/>
+              <w:bottom w:val="single" w:sz="4" w:space="0" w:color="BFBFBF"/>
+              <w:right w:val="single" w:sz="4" w:space="0" w:color="BFBFBF"/>
+            </w:tcBorders>
+            <w:tcMar>
+              <w:top w:w="60" w:type="dxa"/>
+              <w:left w:w="100" w:type="dxa"/>
+              <w:bottom w:w="60" w:type="dxa"/>
+              <w:right w:w="100" w:type="dxa"/>
+            </w:tcMar>
+          </w:tcPr>
+          <w:p>
+            <w:r>
+              <w:t>Should</w:t>
+            </w:r>
+          </w:p>
+        </w:tc>
+      </w:tr>
+      <w:tr>
+        <w:tblPrEx>
+          <w:tblCellMar>
+            <w:top w:w="0" w:type="dxa"/>
+            <w:bottom w:w="0" w:type="dxa"/>
+          </w:tblCellMar>
+        </w:tblPrEx>
+        <w:tc>
+          <w:tcPr>
+            <w:tcW w:w="1100" w:type="dxa"/>
+            <w:tcBorders>
+              <w:top w:val="single" w:sz="4" w:space="0" w:color="BFBFBF"/>
+              <w:left w:val="single" w:sz="4" w:space="0" w:color="BFBFBF"/>
+              <w:bottom w:val="single" w:sz="4" w:space="0" w:color="BFBFBF"/>
+              <w:right w:val="single" w:sz="4" w:space="0" w:color="BFBFBF"/>
+            </w:tcBorders>
+            <w:tcMar>
+              <w:top w:w="60" w:type="dxa"/>
+              <w:left w:w="100" w:type="dxa"/>
+              <w:bottom w:w="60" w:type="dxa"/>
+              <w:right w:w="100" w:type="dxa"/>
+            </w:tcMar>
+          </w:tcPr>
+          <w:p>
+            <w:r>
+              <w:t>FR-10</w:t>
+            </w:r>
+          </w:p>
+        </w:tc>
+        <w:tc>
+          <w:tcPr>
+            <w:tcW w:w="6526" w:type="dxa"/>
+            <w:tcBorders>
+              <w:top w:val="single" w:sz="4" w:space="0" w:color="BFBFBF"/>
+              <w:left w:val="single" w:sz="4" w:space="0" w:color="BFBFBF"/>
+              <w:bottom w:val="single" w:sz="4" w:space="0" w:color="BFBFBF"/>
+              <w:right w:val="single" w:sz="4" w:space="0" w:color="BFBFBF"/>
+            </w:tcBorders>
+            <w:tcMar>
+              <w:top w:w="60" w:type="dxa"/>
+              <w:left w:w="100" w:type="dxa"/>
+              <w:bottom w:w="60" w:type="dxa"/>
+              <w:right w:w="100" w:type="dxa"/>
+            </w:tcMar>
+          </w:tcPr>
+          <w:p>
+            <w:r>
+              <w:t>The system shall let anyone filter the quotes by mood, or show all, without reloading the page.</w:t>
+            </w:r>
+          </w:p>
+        </w:tc>
+        <w:tc>
+          <w:tcPr>
+            <w:tcW w:w="1400" w:type="dxa"/>
+            <w:tcBorders>
+              <w:top w:val="single" w:sz="4" w:space="0" w:color="BFBFBF"/>
+              <w:left w:val="single" w:sz="4" w:space="0" w:color="BFBFBF"/>
+              <w:bottom w:val="single" w:sz="4" w:space="0" w:color="BFBFBF"/>
+              <w:right w:val="single" w:sz="4" w:space="0" w:color="BFBFBF"/>
+            </w:tcBorders>
+            <w:tcMar>
+              <w:top w:w="60" w:type="dxa"/>
+              <w:left w:w="100" w:type="dxa"/>
+              <w:bottom w:w="60" w:type="dxa"/>
+              <w:right w:w="100" w:type="dxa"/>
+            </w:tcMar>
+          </w:tcPr>
+          <w:p>
+            <w:r>
+              <w:t>Should</w:t>
+            </w:r>
+          </w:p>
+        </w:tc>
+      </w:tr>
+      <w:tr>
+        <w:tblPrEx>
+          <w:tblCellMar>
+            <w:top w:w="0" w:type="dxa"/>
+            <w:bottom w:w="0" w:type="dxa"/>
+          </w:tblCellMar>
+        </w:tblPrEx>
+        <w:tc>
+          <w:tcPr>
+            <w:tcW w:w="1100" w:type="dxa"/>
+            <w:tcBorders>
+              <w:top w:val="single" w:sz="4" w:space="0" w:color="BFBFBF"/>
+              <w:left w:val="single" w:sz="4" w:space="0" w:color="BFBFBF"/>
+              <w:bottom w:val="single" w:sz="4" w:space="0" w:color="BFBFBF"/>
+              <w:right w:val="single" w:sz="4" w:space="0" w:color="BFBFBF"/>
+            </w:tcBorders>
+            <w:tcMar>
+              <w:top w:w="60" w:type="dxa"/>
+              <w:left w:w="100" w:type="dxa"/>
+              <w:bottom w:w="60" w:type="dxa"/>
+              <w:right w:w="100" w:type="dxa"/>
+            </w:tcMar>
+          </w:tcPr>
+          <w:p>
+            <w:r>
+              <w:t>FR-11</w:t>
+            </w:r>
+          </w:p>
+        </w:tc>
+        <w:tc>
+          <w:tcPr>
+            <w:tcW w:w="6526" w:type="dxa"/>
+            <w:tcBorders>
+              <w:top w:val="single" w:sz="4" w:space="0" w:color="BFBFBF"/>
+              <w:left w:val="single" w:sz="4" w:space="0" w:color="BFBFBF"/>
+              <w:bottom w:val="single" w:sz="4" w:space="0" w:color="BFBFBF"/>
+              <w:right w:val="single" w:sz="4" w:space="0" w:color="BFBFBF"/>
+            </w:tcBorders>
+            <w:tcMar>
+              <w:top w:w="60" w:type="dxa"/>
+              <w:left w:w="100" w:type="dxa"/>
+              <w:bottom w:w="60" w:type="dxa"/>
+              <w:right w:w="100" w:type="dxa"/>
+            </w:tcMar>
+          </w:tcPr>
+          <w:p>
+            <w:r>
+              <w:t>The system shall show one "Insight of the Day" at the top of the page: a quote picked at random once a day, the same for all visitors, with a button to copy it.</w:t>
+            </w:r>
+          </w:p>
+        </w:tc>
+        <w:tc>
+          <w:tcPr>
+            <w:tcW w:w="1400" w:type="dxa"/>
+            <w:tcBorders>
+              <w:top w:val="single" w:sz="4" w:space="0" w:color="BFBFBF"/>
+              <w:left w:val="single" w:sz="4" w:space="0" w:color="BFBFBF"/>
+              <w:bottom w:val="single" w:sz="4" w:space="0" w:color="BFBFBF"/>
+              <w:right w:val="single" w:sz="4" w:space="0" w:color="BFBFBF"/>
+            </w:tcBorders>
+            <w:tcMar>
+              <w:top w:w="60" w:type="dxa"/>
+              <w:left w:w="100" w:type="dxa"/>
+              <w:bottom w:w="60" w:type="dxa"/>
+              <w:right w:w="100" w:type="dxa"/>
+            </w:tcMar>
+          </w:tcPr>
+          <w:p>
+            <w:r>
+              <w:t>Should</w:t>
+            </w:r>
+          </w:p>
+        </w:tc>
+      </w:tr>
+      <w:tr>
+        <w:tblPrEx>
+          <w:tblCellMar>
+            <w:top w:w="0" w:type="dxa"/>
+            <w:bottom w:w="0" w:type="dxa"/>
+          </w:tblCellMar>
+        </w:tblPrEx>
+        <w:tc>
+          <w:tcPr>
+            <w:tcW w:w="1100" w:type="dxa"/>
+            <w:tcBorders>
+              <w:top w:val="single" w:sz="4" w:space="0" w:color="BFBFBF"/>
+              <w:left w:val="single" w:sz="4" w:space="0" w:color="BFBFBF"/>
+              <w:bottom w:val="single" w:sz="4" w:space="0" w:color="BFBFBF"/>
+              <w:right w:val="single" w:sz="4" w:space="0" w:color="BFBFBF"/>
+            </w:tcBorders>
+            <w:tcMar>
+              <w:top w:w="60" w:type="dxa"/>
+              <w:left w:w="100" w:type="dxa"/>
+              <w:bottom w:w="60" w:type="dxa"/>
+              <w:right w:w="100" w:type="dxa"/>
+            </w:tcMar>
+          </w:tcPr>
+          <w:p>
+            <w:r>
+              <w:t>FR-12</w:t>
+            </w:r>
+          </w:p>
+        </w:tc>
+        <w:tc>
+          <w:tcPr>
+            <w:tcW w:w="6526" w:type="dxa"/>
+            <w:tcBorders>
+              <w:top w:val="single" w:sz="4" w:space="0" w:color="BFBFBF"/>
+              <w:left w:val="single" w:sz="4" w:space="0" w:color="BFBFBF"/>
+              <w:bottom w:val="single" w:sz="4" w:space="0" w:color="BFBFBF"/>
+              <w:right w:val="single" w:sz="4" w:space="0" w:color="BFBFBF"/>
+            </w:tcBorders>
+            <w:tcMar>
+              <w:top w:w="60" w:type="dxa"/>
+              <w:left w:w="100" w:type="dxa"/>
+              <w:bottom w:w="60" w:type="dxa"/>
+              <w:right w:w="100" w:type="dxa"/>
+            </w:tcMar>
+          </w:tcPr>
+          <w:p>
+            <w:r>
+              <w:t>The system shall let anyone turn a quote into a card, choose its color and font, and download it as a PNG image.</w:t>
+            </w:r>
+          </w:p>
+        </w:tc>
+        <w:tc>
+          <w:tcPr>
+            <w:tcW w:w="1400" w:type="dxa"/>
+            <w:tcBorders>
+              <w:top w:val="single" w:sz="4" w:space="0" w:color="BFBFBF"/>
+              <w:left w:val="single" w:sz="4" w:space="0" w:color="BFBFBF"/>
+              <w:bottom w:val="single" w:sz="4" w:space="0" w:color="BFBFBF"/>
+              <w:right w:val="single" w:sz="4" w:space="0" w:color="BFBFBF"/>
+            </w:tcBorders>
+            <w:tcMar>
+              <w:top w:w="60" w:type="dxa"/>
+              <w:left w:w="100" w:type="dxa"/>
+              <w:bottom w:w="60" w:type="dxa"/>
+              <w:right w:w="100" w:type="dxa"/>
+            </w:tcMar>
+          </w:tcPr>
+          <w:p>
+            <w:r>
+              <w:t>Could</w:t>
+            </w:r>
+          </w:p>
+        </w:tc>
+      </w:tr>
+      <w:tr>
+        <w:tblPrEx>
+          <w:tblCellMar>
+            <w:top w:w="0" w:type="dxa"/>
+            <w:bottom w:w="0" w:type="dxa"/>
+          </w:tblCellMar>
+        </w:tblPrEx>
+        <w:tc>
+          <w:tcPr>
+            <w:tcW w:w="1100" w:type="dxa"/>
+            <w:tcBorders>
+              <w:top w:val="single" w:sz="4" w:space="0" w:color="BFBFBF"/>
+              <w:left w:val="single" w:sz="4" w:space="0" w:color="BFBFBF"/>
+              <w:bottom w:val="single" w:sz="4" w:space="0" w:color="BFBFBF"/>
+              <w:right w:val="single" w:sz="4" w:space="0" w:color="BFBFBF"/>
+            </w:tcBorders>
+            <w:tcMar>
+              <w:top w:w="60" w:type="dxa"/>
+              <w:left w:w="100" w:type="dxa"/>
+              <w:bottom w:w="60" w:type="dxa"/>
+              <w:right w:w="100" w:type="dxa"/>
+            </w:tcMar>
+          </w:tcPr>
+          <w:p>
+            <w:r>
+              <w:t>FR-13</w:t>
+            </w:r>
+          </w:p>
+        </w:tc>
+        <w:tc>
+          <w:tcPr>
+            <w:tcW w:w="6526" w:type="dxa"/>
+            <w:tcBorders>
+              <w:top w:val="single" w:sz="4" w:space="0" w:color="BFBFBF"/>
+              <w:left w:val="single" w:sz="4" w:space="0" w:color="BFBFBF"/>
+              <w:bottom w:val="single" w:sz="4" w:space="0" w:color="BFBFBF"/>
+              <w:right w:val="single" w:sz="4" w:space="0" w:color="BFBFBF"/>
+            </w:tcBorders>
+            <w:tcMar>
+              <w:top w:w="60" w:type="dxa"/>
+              <w:left w:w="100" w:type="dxa"/>
+              <w:bottom w:w="60" w:type="dxa"/>
+              <w:right w:w="100" w:type="dxa"/>
+            </w:tcMar>
+          </w:tcPr>
+          <w:p>
+            <w:r>
+              <w:t>The system shall let anyone start a calm session: a full-screen view that shows quotes one after another and can be closed with Esc.</w:t>
+            </w:r>
+          </w:p>
+        </w:tc>
+        <w:tc>
+          <w:tcPr>
+            <w:tcW w:w="1400" w:type="dxa"/>
+            <w:tcBorders>
+              <w:top w:val="single" w:sz="4" w:space="0" w:color="BFBFBF"/>
+              <w:left w:val="single" w:sz="4" w:space="0" w:color="BFBFBF"/>
+              <w:bottom w:val="single" w:sz="4" w:space="0" w:color="BFBFBF"/>
+              <w:right w:val="single" w:sz="4" w:space="0" w:color="BFBFBF"/>
+            </w:tcBorders>
+            <w:tcMar>
+              <w:top w:w="60" w:type="dxa"/>
+              <w:left w:w="100" w:type="dxa"/>
+              <w:bottom w:w="60" w:type="dxa"/>
+              <w:right w:w="100" w:type="dxa"/>
+            </w:tcMar>
+          </w:tcPr>
+          <w:p>
+            <w:r>
+              <w:t>Could</w:t>
             </w:r>
           </w:p>
         </w:tc>
@@ -1892,6 +2596,228 @@
           </w:p>
         </w:tc>
       </w:tr>
+      <w:tr>
+        <w:tblPrEx>
+          <w:tblCellMar>
+            <w:top w:w="0" w:type="dxa"/>
+            <w:bottom w:w="0" w:type="dxa"/>
+          </w:tblCellMar>
+        </w:tblPrEx>
+        <w:tc>
+          <w:tcPr>
+            <w:tcW w:w="1200" w:type="dxa"/>
+            <w:tcBorders>
+              <w:top w:val="single" w:sz="4" w:space="0" w:color="BFBFBF"/>
+              <w:left w:val="single" w:sz="4" w:space="0" w:color="BFBFBF"/>
+              <w:bottom w:val="single" w:sz="4" w:space="0" w:color="BFBFBF"/>
+              <w:right w:val="single" w:sz="4" w:space="0" w:color="BFBFBF"/>
+            </w:tcBorders>
+            <w:tcMar>
+              <w:top w:w="60" w:type="dxa"/>
+              <w:left w:w="100" w:type="dxa"/>
+              <w:bottom w:w="60" w:type="dxa"/>
+              <w:right w:w="100" w:type="dxa"/>
+            </w:tcMar>
+          </w:tcPr>
+          <w:p>
+            <w:r>
+              <w:t>NFR-06</w:t>
+            </w:r>
+          </w:p>
+        </w:tc>
+        <w:tc>
+          <w:tcPr>
+            <w:tcW w:w="1800" w:type="dxa"/>
+            <w:tcBorders>
+              <w:top w:val="single" w:sz="4" w:space="0" w:color="BFBFBF"/>
+              <w:left w:val="single" w:sz="4" w:space="0" w:color="BFBFBF"/>
+              <w:bottom w:val="single" w:sz="4" w:space="0" w:color="BFBFBF"/>
+              <w:right w:val="single" w:sz="4" w:space="0" w:color="BFBFBF"/>
+            </w:tcBorders>
+            <w:tcMar>
+              <w:top w:w="60" w:type="dxa"/>
+              <w:left w:w="100" w:type="dxa"/>
+              <w:bottom w:w="60" w:type="dxa"/>
+              <w:right w:w="100" w:type="dxa"/>
+            </w:tcMar>
+          </w:tcPr>
+          <w:p>
+            <w:r>
+              <w:t>Data integrity</w:t>
+            </w:r>
+          </w:p>
+        </w:tc>
+        <w:tc>
+          <w:tcPr>
+            <w:tcW w:w="6026" w:type="dxa"/>
+            <w:tcBorders>
+              <w:top w:val="single" w:sz="4" w:space="0" w:color="BFBFBF"/>
+              <w:left w:val="single" w:sz="4" w:space="0" w:color="BFBFBF"/>
+              <w:bottom w:val="single" w:sz="4" w:space="0" w:color="BFBFBF"/>
+              <w:right w:val="single" w:sz="4" w:space="0" w:color="BFBFBF"/>
+            </w:tcBorders>
+            <w:tcMar>
+              <w:top w:w="60" w:type="dxa"/>
+              <w:left w:w="100" w:type="dxa"/>
+              <w:bottom w:w="60" w:type="dxa"/>
+              <w:right w:w="100" w:type="dxa"/>
+            </w:tcMar>
+          </w:tcPr>
+          <w:p>
+            <w:r>
+              <w:t>The database shall prevent the same user from liking the same quote twice.</w:t>
+            </w:r>
+          </w:p>
+        </w:tc>
+      </w:tr>
+      <w:tr>
+        <w:tblPrEx>
+          <w:tblCellMar>
+            <w:top w:w="0" w:type="dxa"/>
+            <w:bottom w:w="0" w:type="dxa"/>
+          </w:tblCellMar>
+        </w:tblPrEx>
+        <w:tc>
+          <w:tcPr>
+            <w:tcW w:w="1200" w:type="dxa"/>
+            <w:tcBorders>
+              <w:top w:val="single" w:sz="4" w:space="0" w:color="BFBFBF"/>
+              <w:left w:val="single" w:sz="4" w:space="0" w:color="BFBFBF"/>
+              <w:bottom w:val="single" w:sz="4" w:space="0" w:color="BFBFBF"/>
+              <w:right w:val="single" w:sz="4" w:space="0" w:color="BFBFBF"/>
+            </w:tcBorders>
+            <w:tcMar>
+              <w:top w:w="60" w:type="dxa"/>
+              <w:left w:w="100" w:type="dxa"/>
+              <w:bottom w:w="60" w:type="dxa"/>
+              <w:right w:w="100" w:type="dxa"/>
+            </w:tcMar>
+          </w:tcPr>
+          <w:p>
+            <w:r>
+              <w:t>NFR-07</w:t>
+            </w:r>
+          </w:p>
+        </w:tc>
+        <w:tc>
+          <w:tcPr>
+            <w:tcW w:w="1800" w:type="dxa"/>
+            <w:tcBorders>
+              <w:top w:val="single" w:sz="4" w:space="0" w:color="BFBFBF"/>
+              <w:left w:val="single" w:sz="4" w:space="0" w:color="BFBFBF"/>
+              <w:bottom w:val="single" w:sz="4" w:space="0" w:color="BFBFBF"/>
+              <w:right w:val="single" w:sz="4" w:space="0" w:color="BFBFBF"/>
+            </w:tcBorders>
+            <w:tcMar>
+              <w:top w:w="60" w:type="dxa"/>
+              <w:left w:w="100" w:type="dxa"/>
+              <w:bottom w:w="60" w:type="dxa"/>
+              <w:right w:w="100" w:type="dxa"/>
+            </w:tcMar>
+          </w:tcPr>
+          <w:p>
+            <w:r>
+              <w:t>Usability</w:t>
+            </w:r>
+          </w:p>
+        </w:tc>
+        <w:tc>
+          <w:tcPr>
+            <w:tcW w:w="6026" w:type="dxa"/>
+            <w:tcBorders>
+              <w:top w:val="single" w:sz="4" w:space="0" w:color="BFBFBF"/>
+              <w:left w:val="single" w:sz="4" w:space="0" w:color="BFBFBF"/>
+              <w:bottom w:val="single" w:sz="4" w:space="0" w:color="BFBFBF"/>
+              <w:right w:val="single" w:sz="4" w:space="0" w:color="BFBFBF"/>
+            </w:tcBorders>
+            <w:tcMar>
+              <w:top w:w="60" w:type="dxa"/>
+              <w:left w:w="100" w:type="dxa"/>
+              <w:bottom w:w="60" w:type="dxa"/>
+              <w:right w:w="100" w:type="dxa"/>
+            </w:tcMar>
+          </w:tcPr>
+          <w:p>
+            <w:r>
+              <w:t>Filtering by mood and starting a calm session shall work without reloading the page.</w:t>
+            </w:r>
+          </w:p>
+        </w:tc>
+      </w:tr>
+      <w:tr>
+        <w:tblPrEx>
+          <w:tblCellMar>
+            <w:top w:w="0" w:type="dxa"/>
+            <w:bottom w:w="0" w:type="dxa"/>
+          </w:tblCellMar>
+        </w:tblPrEx>
+        <w:tc>
+          <w:tcPr>
+            <w:tcW w:w="1200" w:type="dxa"/>
+            <w:tcBorders>
+              <w:top w:val="single" w:sz="4" w:space="0" w:color="BFBFBF"/>
+              <w:left w:val="single" w:sz="4" w:space="0" w:color="BFBFBF"/>
+              <w:bottom w:val="single" w:sz="4" w:space="0" w:color="BFBFBF"/>
+              <w:right w:val="single" w:sz="4" w:space="0" w:color="BFBFBF"/>
+            </w:tcBorders>
+            <w:tcMar>
+              <w:top w:w="60" w:type="dxa"/>
+              <w:left w:w="100" w:type="dxa"/>
+              <w:bottom w:w="60" w:type="dxa"/>
+              <w:right w:w="100" w:type="dxa"/>
+            </w:tcMar>
+          </w:tcPr>
+          <w:p>
+            <w:r>
+              <w:t>NFR-08</w:t>
+            </w:r>
+          </w:p>
+        </w:tc>
+        <w:tc>
+          <w:tcPr>
+            <w:tcW w:w="1800" w:type="dxa"/>
+            <w:tcBorders>
+              <w:top w:val="single" w:sz="4" w:space="0" w:color="BFBFBF"/>
+              <w:left w:val="single" w:sz="4" w:space="0" w:color="BFBFBF"/>
+              <w:bottom w:val="single" w:sz="4" w:space="0" w:color="BFBFBF"/>
+              <w:right w:val="single" w:sz="4" w:space="0" w:color="BFBFBF"/>
+            </w:tcBorders>
+            <w:tcMar>
+              <w:top w:w="60" w:type="dxa"/>
+              <w:left w:w="100" w:type="dxa"/>
+              <w:bottom w:w="60" w:type="dxa"/>
+              <w:right w:w="100" w:type="dxa"/>
+            </w:tcMar>
+          </w:tcPr>
+          <w:p>
+            <w:r>
+              <w:t>Usability</w:t>
+            </w:r>
+          </w:p>
+        </w:tc>
+        <w:tc>
+          <w:tcPr>
+            <w:tcW w:w="6026" w:type="dxa"/>
+            <w:tcBorders>
+              <w:top w:val="single" w:sz="4" w:space="0" w:color="BFBFBF"/>
+              <w:left w:val="single" w:sz="4" w:space="0" w:color="BFBFBF"/>
+              <w:bottom w:val="single" w:sz="4" w:space="0" w:color="BFBFBF"/>
+              <w:right w:val="single" w:sz="4" w:space="0" w:color="BFBFBF"/>
+            </w:tcBorders>
+            <w:tcMar>
+              <w:top w:w="60" w:type="dxa"/>
+              <w:left w:w="100" w:type="dxa"/>
+              <w:bottom w:w="60" w:type="dxa"/>
+              <w:right w:w="100" w:type="dxa"/>
+            </w:tcMar>
+          </w:tcPr>
+          <w:p>
+            <w:r>
+              <w:t>The design shall use soft pastel colors with dark text so that the text stays easy to read.</w:t>
+            </w:r>
+          </w:p>
+        </w:tc>
+      </w:tr>
     </w:tbl>
     <w:p>
       <w:pPr>
@@ -1948,7 +2874,7 @@
         <w:spacing w:after="60"/>
       </w:pPr>
       <w:r>
-        <w:t>When I open the website without logging in, then I see all users' quotes, each with the quote text, the name of who shared it, and the date.</w:t>
+        <w:t>When I open the website without logging in, then I see all users' quotes, each with the quote text, the name of who shared it, the date, its mood, and the number of likes.</w:t>
       </w:r>
     </w:p>
     <w:p>
@@ -2230,35 +3156,7 @@
         <w:spacing w:after="60"/>
       </w:pPr>
       <w:r>
-        <w:t>When I press X, then the box closes without sharing.</w:t>
-      </w:r>
-    </w:p>
-    <w:p>
-      <w:pPr>
-        <w:spacing w:before="200" w:after="80"/>
-      </w:pPr>
-      <w:r>
-        <w:rPr>
-          <w:b/>
-          <w:bCs/>
-        </w:rPr>
-        <w:t>US-06 — Edit my quote (FR-06)</w:t>
-      </w:r>
-    </w:p>
-    <w:p>
-      <w:pPr>
-        <w:spacing w:after="120"/>
-        <w:rPr>
-          <w:i/>
-          <w:iCs/>
-        </w:rPr>
-      </w:pPr>
-      <w:r>
-        <w:rPr>
-          <w:i/>
-          <w:iCs/>
-        </w:rPr>
-        <w:t>As a registered user, I want to edit my quote, so that I can fix mistakes.</w:t>
+        <w:t>Given I did not choose a mood, when I press Send, then the quote is not added.</w:t>
       </w:r>
     </w:p>
     <w:p>
@@ -2271,7 +3169,35 @@
         <w:spacing w:after="60"/>
       </w:pPr>
       <w:r>
-        <w:t>When I press the edit icon, then the quote turns into a text box with Save and Cancel buttons.</w:t>
+        <w:t>When I press X, then the box closes without sharing.</w:t>
+      </w:r>
+    </w:p>
+    <w:p>
+      <w:pPr>
+        <w:spacing w:before="200" w:after="80"/>
+      </w:pPr>
+      <w:r>
+        <w:rPr>
+          <w:b/>
+          <w:bCs/>
+        </w:rPr>
+        <w:t>US-06 — Edit my quote (FR-06)</w:t>
+      </w:r>
+    </w:p>
+    <w:p>
+      <w:pPr>
+        <w:spacing w:after="120"/>
+        <w:rPr>
+          <w:i/>
+          <w:iCs/>
+        </w:rPr>
+      </w:pPr>
+      <w:r>
+        <w:rPr>
+          <w:i/>
+          <w:iCs/>
+        </w:rPr>
+        <w:t>As a registered user, I want to edit my quote, so that I can fix mistakes.</w:t>
       </w:r>
     </w:p>
     <w:p>
@@ -2284,7 +3210,7 @@
         <w:spacing w:after="60"/>
       </w:pPr>
       <w:r>
-        <w:t>When I change the text and press Save, then the card shows the updated quote.</w:t>
+        <w:t>When I press the edit icon, then the quote turns into a text box with Save and Cancel buttons.</w:t>
       </w:r>
     </w:p>
     <w:p>
@@ -2297,35 +3223,7 @@
         <w:spacing w:after="60"/>
       </w:pPr>
       <w:r>
-        <w:t>When I press Cancel, then the quote stays as it was.</w:t>
-      </w:r>
-    </w:p>
-    <w:p>
-      <w:pPr>
-        <w:spacing w:before="200" w:after="80"/>
-      </w:pPr>
-      <w:r>
-        <w:rPr>
-          <w:b/>
-          <w:bCs/>
-        </w:rPr>
-        <w:t>US-07 — Delete my quote (FR-07)</w:t>
-      </w:r>
-    </w:p>
-    <w:p>
-      <w:pPr>
-        <w:spacing w:after="120"/>
-        <w:rPr>
-          <w:i/>
-          <w:iCs/>
-        </w:rPr>
-      </w:pPr>
-      <w:r>
-        <w:rPr>
-          <w:i/>
-          <w:iCs/>
-        </w:rPr>
-        <w:t>As a registered user, I want to delete my quote, so that I can remove ones I no longer want.</w:t>
+        <w:t>When I change the text and press Save, then the card shows the updated quote.</w:t>
       </w:r>
     </w:p>
     <w:p>
@@ -2338,7 +3236,396 @@
         <w:spacing w:after="60"/>
       </w:pPr>
       <w:r>
+        <w:t>When I press Cancel, then the quote stays as it was.</w:t>
+      </w:r>
+    </w:p>
+    <w:p>
+      <w:pPr>
+        <w:spacing w:before="200" w:after="80"/>
+      </w:pPr>
+      <w:r>
+        <w:rPr>
+          <w:b/>
+          <w:bCs/>
+        </w:rPr>
+        <w:t>US-07 — Delete my quote (FR-07)</w:t>
+      </w:r>
+    </w:p>
+    <w:p>
+      <w:pPr>
+        <w:spacing w:after="120"/>
+        <w:rPr>
+          <w:i/>
+          <w:iCs/>
+        </w:rPr>
+      </w:pPr>
+      <w:r>
+        <w:rPr>
+          <w:i/>
+          <w:iCs/>
+        </w:rPr>
+        <w:t>As a registered user, I want to delete my quote, so that I can remove ones I no longer want.</w:t>
+      </w:r>
+    </w:p>
+    <w:p>
+      <w:pPr>
+        <w:pStyle w:val="a4"/>
+        <w:numPr>
+          <w:ilvl w:val="0"/>
+          <w:numId w:val="2"/>
+        </w:numPr>
+        <w:spacing w:after="60"/>
+      </w:pPr>
+      <w:r>
         <w:t>When I press the delete icon, then the quote is removed from the list right away, for me and for everyone.</w:t>
+      </w:r>
+    </w:p>
+    <w:p>
+      <w:pPr>
+        <w:spacing w:before="200" w:after="80"/>
+      </w:pPr>
+      <w:r>
+        <w:rPr>
+          <w:b/>
+          <w:bCs/>
+        </w:rPr>
+        <w:t>US-08 — Like a quote (FR-08, FR-09)</w:t>
+      </w:r>
+    </w:p>
+    <w:p>
+      <w:pPr>
+        <w:spacing w:after="120"/>
+        <w:rPr>
+          <w:i/>
+          <w:iCs/>
+        </w:rPr>
+      </w:pPr>
+      <w:r>
+        <w:rPr>
+          <w:i/>
+          <w:iCs/>
+        </w:rPr>
+        <w:t>As a registered user, I want to like quotes I enjoy, so that I can show appreciation and see which quotes are liked most.</w:t>
+      </w:r>
+    </w:p>
+    <w:p>
+      <w:pPr>
+        <w:pStyle w:val="a4"/>
+        <w:numPr>
+          <w:ilvl w:val="0"/>
+          <w:numId w:val="2"/>
+        </w:numPr>
+        <w:spacing w:after="60"/>
+      </w:pPr>
+      <w:r>
+        <w:t>When I press the heart under a quote, then the heart turns red and the number of likes goes up by one.</w:t>
+      </w:r>
+    </w:p>
+    <w:p>
+      <w:pPr>
+        <w:pStyle w:val="a4"/>
+        <w:numPr>
+          <w:ilvl w:val="0"/>
+          <w:numId w:val="2"/>
+        </w:numPr>
+        <w:spacing w:after="60"/>
+      </w:pPr>
+      <w:r>
+        <w:t>When I press the red heart again, then my like is removed and the number goes down by one.</w:t>
+      </w:r>
+    </w:p>
+    <w:p>
+      <w:pPr>
+        <w:pStyle w:val="a4"/>
+        <w:numPr>
+          <w:ilvl w:val="0"/>
+          <w:numId w:val="2"/>
+        </w:numPr>
+        <w:spacing w:after="60"/>
+      </w:pPr>
+      <w:r>
+        <w:t>Each user can like a quote only once.</w:t>
+      </w:r>
+    </w:p>
+    <w:p>
+      <w:pPr>
+        <w:pStyle w:val="a4"/>
+        <w:numPr>
+          <w:ilvl w:val="0"/>
+          <w:numId w:val="2"/>
+        </w:numPr>
+        <w:spacing w:after="60"/>
+      </w:pPr>
+      <w:r>
+        <w:t>As a guest, I see the number of likes on each quote but I cannot press the heart.</w:t>
+      </w:r>
+    </w:p>
+    <w:p>
+      <w:pPr>
+        <w:spacing w:before="200" w:after="80"/>
+      </w:pPr>
+      <w:r>
+        <w:rPr>
+          <w:b/>
+          <w:bCs/>
+        </w:rPr>
+        <w:t>US-09 — Filter quotes by mood (FR-10)</w:t>
+      </w:r>
+    </w:p>
+    <w:p>
+      <w:pPr>
+        <w:spacing w:after="120"/>
+        <w:rPr>
+          <w:i/>
+          <w:iCs/>
+        </w:rPr>
+      </w:pPr>
+      <w:r>
+        <w:rPr>
+          <w:i/>
+          <w:iCs/>
+        </w:rPr>
+        <w:t>As a user, I want to pick a mood, so that I see the quotes that match how I feel.</w:t>
+      </w:r>
+    </w:p>
+    <w:p>
+      <w:pPr>
+        <w:pStyle w:val="a4"/>
+        <w:numPr>
+          <w:ilvl w:val="0"/>
+          <w:numId w:val="2"/>
+        </w:numPr>
+        <w:spacing w:after="60"/>
+      </w:pPr>
+      <w:r>
+        <w:t>When I press a mood button (Hope, Calm, Philosophy, or Motivation), then only quotes with that mood stay on the page, without reloading.</w:t>
+      </w:r>
+    </w:p>
+    <w:p>
+      <w:pPr>
+        <w:pStyle w:val="a4"/>
+        <w:numPr>
+          <w:ilvl w:val="0"/>
+          <w:numId w:val="2"/>
+        </w:numPr>
+        <w:spacing w:after="60"/>
+      </w:pPr>
+      <w:r>
+        <w:t>When I press "All", then all quotes are shown again.</w:t>
+      </w:r>
+    </w:p>
+    <w:p>
+      <w:pPr>
+        <w:pStyle w:val="a4"/>
+        <w:numPr>
+          <w:ilvl w:val="0"/>
+          <w:numId w:val="2"/>
+        </w:numPr>
+        <w:spacing w:after="60"/>
+      </w:pPr>
+      <w:r>
+        <w:t>Quotes shared before moods existed have no mood and appear only under "All".</w:t>
+      </w:r>
+    </w:p>
+    <w:p>
+      <w:pPr>
+        <w:spacing w:before="200" w:after="80"/>
+      </w:pPr>
+      <w:r>
+        <w:rPr>
+          <w:b/>
+          <w:bCs/>
+        </w:rPr>
+        <w:t>US-10 — See the Insight of the Day (FR-11)</w:t>
+      </w:r>
+    </w:p>
+    <w:p>
+      <w:pPr>
+        <w:spacing w:after="120"/>
+        <w:rPr>
+          <w:i/>
+          <w:iCs/>
+        </w:rPr>
+      </w:pPr>
+      <w:r>
+        <w:rPr>
+          <w:i/>
+          <w:iCs/>
+        </w:rPr>
+        <w:t>As a user, I want to see one highlighted quote each day, so that I get a thought to start with.</w:t>
+      </w:r>
+    </w:p>
+    <w:p>
+      <w:pPr>
+        <w:pStyle w:val="a4"/>
+        <w:numPr>
+          <w:ilvl w:val="0"/>
+          <w:numId w:val="2"/>
+        </w:numPr>
+        <w:spacing w:after="60"/>
+      </w:pPr>
+      <w:r>
+        <w:t>When I open the website, then I see a highlighted quote at the top of the page.</w:t>
+      </w:r>
+    </w:p>
+    <w:p>
+      <w:pPr>
+        <w:pStyle w:val="a4"/>
+        <w:numPr>
+          <w:ilvl w:val="0"/>
+          <w:numId w:val="2"/>
+        </w:numPr>
+        <w:spacing w:after="60"/>
+      </w:pPr>
+      <w:r>
+        <w:t>When I come back later the same day, then I see the same quote; on the next day it can be different.</w:t>
+      </w:r>
+    </w:p>
+    <w:p>
+      <w:pPr>
+        <w:pStyle w:val="a4"/>
+        <w:numPr>
+          <w:ilvl w:val="0"/>
+          <w:numId w:val="2"/>
+        </w:numPr>
+        <w:spacing w:after="60"/>
+      </w:pPr>
+      <w:r>
+        <w:t>When I press Copy, then the quote text is copied and the button shows "Copied".</w:t>
+      </w:r>
+    </w:p>
+    <w:p>
+      <w:pPr>
+        <w:spacing w:before="200" w:after="80"/>
+      </w:pPr>
+      <w:r>
+        <w:rPr>
+          <w:b/>
+          <w:bCs/>
+        </w:rPr>
+        <w:t>US-11 — Make a quote card (FR-12)</w:t>
+      </w:r>
+    </w:p>
+    <w:p>
+      <w:pPr>
+        <w:spacing w:after="120"/>
+        <w:rPr>
+          <w:i/>
+          <w:iCs/>
+        </w:rPr>
+      </w:pPr>
+      <w:r>
+        <w:rPr>
+          <w:i/>
+          <w:iCs/>
+        </w:rPr>
+        <w:t>As a user, I want to turn a quote into an image, so that I can share it outside the website.</w:t>
+      </w:r>
+    </w:p>
+    <w:p>
+      <w:pPr>
+        <w:pStyle w:val="a4"/>
+        <w:numPr>
+          <w:ilvl w:val="0"/>
+          <w:numId w:val="2"/>
+        </w:numPr>
+        <w:spacing w:after="60"/>
+      </w:pPr>
+      <w:r>
+        <w:t>When I press Card under a quote, then a preview card opens with the quote, its author, and the Edrak! mark.</w:t>
+      </w:r>
+    </w:p>
+    <w:p>
+      <w:pPr>
+        <w:pStyle w:val="a4"/>
+        <w:numPr>
+          <w:ilvl w:val="0"/>
+          <w:numId w:val="2"/>
+        </w:numPr>
+        <w:spacing w:after="60"/>
+      </w:pPr>
+      <w:r>
+        <w:t>When I choose another color or font, then the preview changes right away.</w:t>
+      </w:r>
+    </w:p>
+    <w:p>
+      <w:pPr>
+        <w:pStyle w:val="a4"/>
+        <w:numPr>
+          <w:ilvl w:val="0"/>
+          <w:numId w:val="2"/>
+        </w:numPr>
+        <w:spacing w:after="60"/>
+      </w:pPr>
+      <w:r>
+        <w:t>When I press Download PNG, then an image file of the card is saved to my device.</w:t>
+      </w:r>
+    </w:p>
+    <w:p>
+      <w:pPr>
+        <w:spacing w:before="200" w:after="80"/>
+      </w:pPr>
+      <w:r>
+        <w:rPr>
+          <w:b/>
+          <w:bCs/>
+        </w:rPr>
+        <w:t>US-12 — Calm session (FR-13)</w:t>
+      </w:r>
+    </w:p>
+    <w:p>
+      <w:pPr>
+        <w:spacing w:after="120"/>
+        <w:rPr>
+          <w:i/>
+          <w:iCs/>
+        </w:rPr>
+      </w:pPr>
+      <w:r>
+        <w:rPr>
+          <w:i/>
+          <w:iCs/>
+        </w:rPr>
+        <w:t>As a user, I want a quiet full-screen view of quotes, so that I can pause and clear my mind.</w:t>
+      </w:r>
+    </w:p>
+    <w:p>
+      <w:pPr>
+        <w:pStyle w:val="a4"/>
+        <w:numPr>
+          <w:ilvl w:val="0"/>
+          <w:numId w:val="2"/>
+        </w:numPr>
+        <w:spacing w:after="60"/>
+      </w:pPr>
+      <w:r>
+        <w:t>When I press "Start a calm session", then a full-screen page shows one quote at a time.</w:t>
+      </w:r>
+    </w:p>
+    <w:p>
+      <w:pPr>
+        <w:pStyle w:val="a4"/>
+        <w:numPr>
+          <w:ilvl w:val="0"/>
+          <w:numId w:val="2"/>
+        </w:numPr>
+        <w:spacing w:after="60"/>
+      </w:pPr>
+      <w:r>
+        <w:t>The quote changes by itself every 8 seconds, and Next shows the next one right away.</w:t>
+      </w:r>
+    </w:p>
+    <w:p>
+      <w:pPr>
+        <w:pStyle w:val="a4"/>
+        <w:numPr>
+          <w:ilvl w:val="0"/>
+          <w:numId w:val="2"/>
+        </w:numPr>
+        <w:spacing w:after="60"/>
+      </w:pPr>
+      <w:r>
+        <w:t>When I press Esc or the close button, then I return to the quotes page.</w:t>
       </w:r>
     </w:p>
     <w:p>
@@ -2361,7 +3648,7 @@
         <w:lastRenderedPageBreak/>
         <w:drawing>
           <wp:inline distT="0" distB="0" distL="0" distR="0" wp14:anchorId="2AD6BCFC" wp14:editId="0B1CDF6D">
-            <wp:extent cx="5334000" cy="3667125"/>
+            <wp:extent cx="5334000" cy="4930098"/>
             <wp:effectExtent l="0" t="0" r="0" b="0"/>
             <wp:docPr id="1" name="صورة 1"/>
             <wp:cNvGraphicFramePr>
@@ -2386,7 +3673,7 @@
                   <pic:spPr bwMode="auto">
                     <a:xfrm>
                       <a:off x="0" y="0"/>
-                      <a:ext cx="5334000" cy="3667125"/>
+                      <a:ext cx="5334000" cy="4930098"/>
                     </a:xfrm>
                     <a:prstGeom prst="rect">
                       <a:avLst/>
@@ -2404,7 +3691,7 @@
         <w:spacing w:after="120"/>
       </w:pPr>
       <w:r>
-        <w:t>A guest can view all quotes, sign up, and log in. A registered user can do everything a guest can, plus log out, share quotes, and edit or delete their own. Sharing a quote is the core use case.</w:t>
+        <w:t>A guest can view all quotes, filter them by mood, see the Insight of the Day, make quote cards, start a calm session, sign up, and log in. A registered user can do everything a guest can, plus log out, share quotes, like or unlike any quote, and edit or delete their own. Sharing a quote is the core use case.</w:t>
       </w:r>
     </w:p>
     <w:p>
@@ -2568,6 +3855,71 @@
       </w:pPr>
       <w:r>
         <w:t>The website runs in the browser only; there is no app to download.</w:t>
+      </w:r>
+    </w:p>
+    <w:p>
+      <w:pPr>
+        <w:pStyle w:val="a4"/>
+        <w:numPr>
+          <w:ilvl w:val="0"/>
+          <w:numId w:val="2"/>
+        </w:numPr>
+        <w:spacing w:after="60"/>
+      </w:pPr>
+      <w:r>
+        <w:t>The system is built with Laravel (PHP) and a MySQL database, using Laravel Breeze for sign up and log in, and Alpine.js with Tailwind CSS for the interface.</w:t>
+      </w:r>
+    </w:p>
+    <w:p>
+      <w:pPr>
+        <w:pStyle w:val="a4"/>
+        <w:numPr>
+          <w:ilvl w:val="0"/>
+          <w:numId w:val="2"/>
+        </w:numPr>
+        <w:spacing w:after="60"/>
+      </w:pPr>
+      <w:r>
+        <w:t>Only logged-in users can like a quote; guests can only see the number of likes.</w:t>
+      </w:r>
+    </w:p>
+    <w:p>
+      <w:pPr>
+        <w:pStyle w:val="a4"/>
+        <w:numPr>
+          <w:ilvl w:val="0"/>
+          <w:numId w:val="2"/>
+        </w:numPr>
+        <w:spacing w:after="60"/>
+      </w:pPr>
+      <w:r>
+        <w:t>The look follows the Edrak! identity and the Tuwaiq Club theme: soft pastel colors, the Edrak! logo next to the Tuwaiq logo, and one fixed profile picture shown for every user.</w:t>
+      </w:r>
+    </w:p>
+    <w:p>
+      <w:pPr>
+        <w:pStyle w:val="a4"/>
+        <w:numPr>
+          <w:ilvl w:val="0"/>
+          <w:numId w:val="2"/>
+        </w:numPr>
+        <w:spacing w:after="60"/>
+      </w:pPr>
+      <w:r>
+        <w:t>Each quote has one mood: Hope, Calm, Philosophy, or Motivation. Quotes shared before moods existed have no mood.</w:t>
+      </w:r>
+    </w:p>
+    <w:p>
+      <w:pPr>
+        <w:pStyle w:val="a4"/>
+        <w:numPr>
+          <w:ilvl w:val="0"/>
+          <w:numId w:val="2"/>
+        </w:numPr>
+        <w:spacing w:after="60"/>
+      </w:pPr>
+      <w:r>
+        <w:t>The Insight of the Day is picked once per day and kept for that day, so all visitors see the same quote.</w:t>
       </w:r>
     </w:p>
     <w:sectPr>

</xml_diff>

<commit_message>
Final: SRS v1.6 with search and stamp, mood editing in edit form
</commit_message>
<xml_diff>
--- a/docs/QuoteIt_SRS.docx
+++ b/docs/QuoteIt_SRS.docx
@@ -40,7 +40,7 @@
         <w:rPr>
           <w:color w:val="808080"/>
         </w:rPr>
-        <w:t>Version 1.5 · October 2026</w:t>
+        <w:t>Version 1.6 · October 2026</w:t>
       </w:r>
     </w:p>
     <w:p>
@@ -57,7 +57,7 @@
         <w:spacing w:after="120"/>
       </w:pPr>
       <w:r>
-        <w:t>Edrak! (code name QuoteIt) is a website where anyone can read quotes shared by others, and registered users can share quotes with a mood and like, edit, or delete them. This SRS describes the final version that was built, including the added features (likes, mood compass, Insight of the Day, quote cards, and calm session), and is the team's reference for the next stages.</w:t>
+        <w:t>Edrak! (code name QuoteIt) is a website where anyone can read quotes shared by others, and registered users can share quotes with a mood and like, edit, or delete them. This SRS describes the final version that was built, including the added features (likes, mood compass, search, Insight of the Day, quote cards, calm session, and My Insights), and is the team's reference for the next stages.</w:t>
       </w:r>
     </w:p>
     <w:p>
@@ -497,7 +497,7 @@
           </w:tcPr>
           <w:p>
             <w:r>
-              <w:t>Searching quotes by keyword or meaning</w:t>
+              <w:t>Searching quotes by meaning (AI)</w:t>
             </w:r>
           </w:p>
         </w:tc>
@@ -653,7 +653,7 @@
           </w:tcPr>
           <w:p>
             <w:r>
-              <w:t>A page of personally saved quotes</w:t>
+              <w:t>Sharing a saved list with other users</w:t>
             </w:r>
           </w:p>
         </w:tc>
@@ -706,6 +706,110 @@
           <w:p>
             <w:r>
               <w:t>A mobile app</w:t>
+            </w:r>
+          </w:p>
+        </w:tc>
+      </w:tr>
+      <w:tr>
+        <w:tblPrEx>
+          <w:tblCellMar>
+            <w:top w:w="0" w:type="dxa"/>
+            <w:bottom w:w="0" w:type="dxa"/>
+          </w:tblCellMar>
+        </w:tblPrEx>
+        <w:tc>
+          <w:tcPr>
+            <w:tcW w:w="4513" w:type="dxa"/>
+            <w:tcBorders>
+              <w:top w:val="single" w:sz="4" w:space="0" w:color="BFBFBF"/>
+              <w:left w:val="single" w:sz="4" w:space="0" w:color="BFBFBF"/>
+              <w:bottom w:val="single" w:sz="4" w:space="0" w:color="BFBFBF"/>
+              <w:right w:val="single" w:sz="4" w:space="0" w:color="BFBFBF"/>
+            </w:tcBorders>
+            <w:tcMar>
+              <w:top w:w="60" w:type="dxa"/>
+              <w:left w:w="100" w:type="dxa"/>
+              <w:bottom w:w="60" w:type="dxa"/>
+              <w:right w:w="100" w:type="dxa"/>
+            </w:tcMar>
+          </w:tcPr>
+          <w:p>
+            <w:r>
+              <w:t>Save quotes to My Insights</w:t>
+            </w:r>
+          </w:p>
+        </w:tc>
+        <w:tc>
+          <w:tcPr>
+            <w:tcW w:w="4513" w:type="dxa"/>
+            <w:tcBorders>
+              <w:top w:val="single" w:sz="4" w:space="0" w:color="BFBFBF"/>
+              <w:left w:val="single" w:sz="4" w:space="0" w:color="BFBFBF"/>
+              <w:bottom w:val="single" w:sz="4" w:space="0" w:color="BFBFBF"/>
+              <w:right w:val="single" w:sz="4" w:space="0" w:color="BFBFBF"/>
+            </w:tcBorders>
+            <w:tcMar>
+              <w:top w:w="60" w:type="dxa"/>
+              <w:left w:w="100" w:type="dxa"/>
+              <w:bottom w:w="60" w:type="dxa"/>
+              <w:right w:w="100" w:type="dxa"/>
+            </w:tcMar>
+          </w:tcPr>
+          <w:p>
+            <w:r>
+              <w:t>Signing in with other services (e.g. Google)</w:t>
+            </w:r>
+          </w:p>
+        </w:tc>
+      </w:tr>
+      <w:tr>
+        <w:tblPrEx>
+          <w:tblCellMar>
+            <w:top w:w="0" w:type="dxa"/>
+            <w:bottom w:w="0" w:type="dxa"/>
+          </w:tblCellMar>
+        </w:tblPrEx>
+        <w:tc>
+          <w:tcPr>
+            <w:tcW w:w="4513" w:type="dxa"/>
+            <w:tcBorders>
+              <w:top w:val="single" w:sz="4" w:space="0" w:color="BFBFBF"/>
+              <w:left w:val="single" w:sz="4" w:space="0" w:color="BFBFBF"/>
+              <w:bottom w:val="single" w:sz="4" w:space="0" w:color="BFBFBF"/>
+              <w:right w:val="single" w:sz="4" w:space="0" w:color="BFBFBF"/>
+            </w:tcBorders>
+            <w:tcMar>
+              <w:top w:w="60" w:type="dxa"/>
+              <w:left w:w="100" w:type="dxa"/>
+              <w:bottom w:w="60" w:type="dxa"/>
+              <w:right w:w="100" w:type="dxa"/>
+            </w:tcMar>
+          </w:tcPr>
+          <w:p>
+            <w:r>
+              <w:t>Search quotes by a word or the author name</w:t>
+            </w:r>
+          </w:p>
+        </w:tc>
+        <w:tc>
+          <w:tcPr>
+            <w:tcW w:w="4513" w:type="dxa"/>
+            <w:tcBorders>
+              <w:top w:val="single" w:sz="4" w:space="0" w:color="BFBFBF"/>
+              <w:left w:val="single" w:sz="4" w:space="0" w:color="BFBFBF"/>
+              <w:bottom w:val="single" w:sz="4" w:space="0" w:color="BFBFBF"/>
+              <w:right w:val="single" w:sz="4" w:space="0" w:color="BFBFBF"/>
+            </w:tcBorders>
+            <w:tcMar>
+              <w:top w:w="60" w:type="dxa"/>
+              <w:left w:w="100" w:type="dxa"/>
+              <w:bottom w:w="60" w:type="dxa"/>
+              <w:right w:w="100" w:type="dxa"/>
+            </w:tcMar>
+          </w:tcPr>
+          <w:p>
+            <w:r>
+              <w:t>Email or push notifications</w:t>
             </w:r>
           </w:p>
         </w:tc>
@@ -914,7 +1018,7 @@
           </w:tcPr>
           <w:p>
             <w:r>
-              <w:t>Read all shared quotes, filter them by mood, make quote cards; sign up or log in</w:t>
+              <w:t>Read all shared quotes, search and filter them by mood, make quote cards; sign up or log in</w:t>
             </w:r>
           </w:p>
         </w:tc>
@@ -988,7 +1092,7 @@
           </w:tcPr>
           <w:p>
             <w:r>
-              <w:t>Read all quotes; share (with a mood), like, edit, and delete their own quotes</w:t>
+              <w:t>Read all quotes; share (with a mood), like, save, edit, and delete their own quotes</w:t>
             </w:r>
           </w:p>
         </w:tc>
@@ -1546,7 +1650,7 @@
           </w:tcPr>
           <w:p>
             <w:r>
-              <w:t>The system shall let a user edit only their own quotes.</w:t>
+              <w:t>The system shall let a user edit only their own quotes, including the text and the mood.</w:t>
             </w:r>
           </w:p>
         </w:tc>
@@ -2065,6 +2169,228 @@
           <w:p>
             <w:r>
               <w:t>The system shall let anyone start a calm session: a full-screen view that shows quotes one after another and can be closed with Esc.</w:t>
+            </w:r>
+          </w:p>
+        </w:tc>
+        <w:tc>
+          <w:tcPr>
+            <w:tcW w:w="1400" w:type="dxa"/>
+            <w:tcBorders>
+              <w:top w:val="single" w:sz="4" w:space="0" w:color="BFBFBF"/>
+              <w:left w:val="single" w:sz="4" w:space="0" w:color="BFBFBF"/>
+              <w:bottom w:val="single" w:sz="4" w:space="0" w:color="BFBFBF"/>
+              <w:right w:val="single" w:sz="4" w:space="0" w:color="BFBFBF"/>
+            </w:tcBorders>
+            <w:tcMar>
+              <w:top w:w="60" w:type="dxa"/>
+              <w:left w:w="100" w:type="dxa"/>
+              <w:bottom w:w="60" w:type="dxa"/>
+              <w:right w:w="100" w:type="dxa"/>
+            </w:tcMar>
+          </w:tcPr>
+          <w:p>
+            <w:r>
+              <w:t>Could</w:t>
+            </w:r>
+          </w:p>
+        </w:tc>
+      </w:tr>
+      <w:tr>
+        <w:tblPrEx>
+          <w:tblCellMar>
+            <w:top w:w="0" w:type="dxa"/>
+            <w:bottom w:w="0" w:type="dxa"/>
+          </w:tblCellMar>
+        </w:tblPrEx>
+        <w:tc>
+          <w:tcPr>
+            <w:tcW w:w="1100" w:type="dxa"/>
+            <w:tcBorders>
+              <w:top w:val="single" w:sz="4" w:space="0" w:color="BFBFBF"/>
+              <w:left w:val="single" w:sz="4" w:space="0" w:color="BFBFBF"/>
+              <w:bottom w:val="single" w:sz="4" w:space="0" w:color="BFBFBF"/>
+              <w:right w:val="single" w:sz="4" w:space="0" w:color="BFBFBF"/>
+            </w:tcBorders>
+            <w:tcMar>
+              <w:top w:w="60" w:type="dxa"/>
+              <w:left w:w="100" w:type="dxa"/>
+              <w:bottom w:w="60" w:type="dxa"/>
+              <w:right w:w="100" w:type="dxa"/>
+            </w:tcMar>
+          </w:tcPr>
+          <w:p>
+            <w:r>
+              <w:t>FR-14</w:t>
+            </w:r>
+          </w:p>
+        </w:tc>
+        <w:tc>
+          <w:tcPr>
+            <w:tcW w:w="6526" w:type="dxa"/>
+            <w:tcBorders>
+              <w:top w:val="single" w:sz="4" w:space="0" w:color="BFBFBF"/>
+              <w:left w:val="single" w:sz="4" w:space="0" w:color="BFBFBF"/>
+              <w:bottom w:val="single" w:sz="4" w:space="0" w:color="BFBFBF"/>
+              <w:right w:val="single" w:sz="4" w:space="0" w:color="BFBFBF"/>
+            </w:tcBorders>
+            <w:tcMar>
+              <w:top w:w="60" w:type="dxa"/>
+              <w:left w:w="100" w:type="dxa"/>
+              <w:bottom w:w="60" w:type="dxa"/>
+              <w:right w:w="100" w:type="dxa"/>
+            </w:tcMar>
+          </w:tcPr>
+          <w:p>
+            <w:r>
+              <w:t>The system shall let a logged-in user save any quote to a personal page called My Insights, remove it again, and see only their own saved quotes there.</w:t>
+            </w:r>
+          </w:p>
+        </w:tc>
+        <w:tc>
+          <w:tcPr>
+            <w:tcW w:w="1400" w:type="dxa"/>
+            <w:tcBorders>
+              <w:top w:val="single" w:sz="4" w:space="0" w:color="BFBFBF"/>
+              <w:left w:val="single" w:sz="4" w:space="0" w:color="BFBFBF"/>
+              <w:bottom w:val="single" w:sz="4" w:space="0" w:color="BFBFBF"/>
+              <w:right w:val="single" w:sz="4" w:space="0" w:color="BFBFBF"/>
+            </w:tcBorders>
+            <w:tcMar>
+              <w:top w:w="60" w:type="dxa"/>
+              <w:left w:w="100" w:type="dxa"/>
+              <w:bottom w:w="60" w:type="dxa"/>
+              <w:right w:w="100" w:type="dxa"/>
+            </w:tcMar>
+          </w:tcPr>
+          <w:p>
+            <w:r>
+              <w:t>Should</w:t>
+            </w:r>
+          </w:p>
+        </w:tc>
+      </w:tr>
+      <w:tr>
+        <w:tblPrEx>
+          <w:tblCellMar>
+            <w:top w:w="0" w:type="dxa"/>
+            <w:bottom w:w="0" w:type="dxa"/>
+          </w:tblCellMar>
+        </w:tblPrEx>
+        <w:tc>
+          <w:tcPr>
+            <w:tcW w:w="1100" w:type="dxa"/>
+            <w:tcBorders>
+              <w:top w:val="single" w:sz="4" w:space="0" w:color="BFBFBF"/>
+              <w:left w:val="single" w:sz="4" w:space="0" w:color="BFBFBF"/>
+              <w:bottom w:val="single" w:sz="4" w:space="0" w:color="BFBFBF"/>
+              <w:right w:val="single" w:sz="4" w:space="0" w:color="BFBFBF"/>
+            </w:tcBorders>
+            <w:tcMar>
+              <w:top w:w="60" w:type="dxa"/>
+              <w:left w:w="100" w:type="dxa"/>
+              <w:bottom w:w="60" w:type="dxa"/>
+              <w:right w:w="100" w:type="dxa"/>
+            </w:tcMar>
+          </w:tcPr>
+          <w:p>
+            <w:r>
+              <w:t>FR-15</w:t>
+            </w:r>
+          </w:p>
+        </w:tc>
+        <w:tc>
+          <w:tcPr>
+            <w:tcW w:w="6526" w:type="dxa"/>
+            <w:tcBorders>
+              <w:top w:val="single" w:sz="4" w:space="0" w:color="BFBFBF"/>
+              <w:left w:val="single" w:sz="4" w:space="0" w:color="BFBFBF"/>
+              <w:bottom w:val="single" w:sz="4" w:space="0" w:color="BFBFBF"/>
+              <w:right w:val="single" w:sz="4" w:space="0" w:color="BFBFBF"/>
+            </w:tcBorders>
+            <w:tcMar>
+              <w:top w:w="60" w:type="dxa"/>
+              <w:left w:w="100" w:type="dxa"/>
+              <w:bottom w:w="60" w:type="dxa"/>
+              <w:right w:w="100" w:type="dxa"/>
+            </w:tcMar>
+          </w:tcPr>
+          <w:p>
+            <w:r>
+              <w:t>The system shall let anyone search the quotes by a word from the text or by the author name; the results update as the person types and work together with the mood filter.</w:t>
+            </w:r>
+          </w:p>
+        </w:tc>
+        <w:tc>
+          <w:tcPr>
+            <w:tcW w:w="1400" w:type="dxa"/>
+            <w:tcBorders>
+              <w:top w:val="single" w:sz="4" w:space="0" w:color="BFBFBF"/>
+              <w:left w:val="single" w:sz="4" w:space="0" w:color="BFBFBF"/>
+              <w:bottom w:val="single" w:sz="4" w:space="0" w:color="BFBFBF"/>
+              <w:right w:val="single" w:sz="4" w:space="0" w:color="BFBFBF"/>
+            </w:tcBorders>
+            <w:tcMar>
+              <w:top w:w="60" w:type="dxa"/>
+              <w:left w:w="100" w:type="dxa"/>
+              <w:bottom w:w="60" w:type="dxa"/>
+              <w:right w:w="100" w:type="dxa"/>
+            </w:tcMar>
+          </w:tcPr>
+          <w:p>
+            <w:r>
+              <w:t>Should</w:t>
+            </w:r>
+          </w:p>
+        </w:tc>
+      </w:tr>
+      <w:tr>
+        <w:tblPrEx>
+          <w:tblCellMar>
+            <w:top w:w="0" w:type="dxa"/>
+            <w:bottom w:w="0" w:type="dxa"/>
+          </w:tblCellMar>
+        </w:tblPrEx>
+        <w:tc>
+          <w:tcPr>
+            <w:tcW w:w="1100" w:type="dxa"/>
+            <w:tcBorders>
+              <w:top w:val="single" w:sz="4" w:space="0" w:color="BFBFBF"/>
+              <w:left w:val="single" w:sz="4" w:space="0" w:color="BFBFBF"/>
+              <w:bottom w:val="single" w:sz="4" w:space="0" w:color="BFBFBF"/>
+              <w:right w:val="single" w:sz="4" w:space="0" w:color="BFBFBF"/>
+            </w:tcBorders>
+            <w:tcMar>
+              <w:top w:w="60" w:type="dxa"/>
+              <w:left w:w="100" w:type="dxa"/>
+              <w:bottom w:w="60" w:type="dxa"/>
+              <w:right w:w="100" w:type="dxa"/>
+            </w:tcMar>
+          </w:tcPr>
+          <w:p>
+            <w:r>
+              <w:t>FR-16</w:t>
+            </w:r>
+          </w:p>
+        </w:tc>
+        <w:tc>
+          <w:tcPr>
+            <w:tcW w:w="6526" w:type="dxa"/>
+            <w:tcBorders>
+              <w:top w:val="single" w:sz="4" w:space="0" w:color="BFBFBF"/>
+              <w:left w:val="single" w:sz="4" w:space="0" w:color="BFBFBF"/>
+              <w:bottom w:val="single" w:sz="4" w:space="0" w:color="BFBFBF"/>
+              <w:right w:val="single" w:sz="4" w:space="0" w:color="BFBFBF"/>
+            </w:tcBorders>
+            <w:tcMar>
+              <w:top w:w="60" w:type="dxa"/>
+              <w:left w:w="100" w:type="dxa"/>
+              <w:bottom w:w="60" w:type="dxa"/>
+              <w:right w:w="100" w:type="dxa"/>
+            </w:tcMar>
+          </w:tcPr>
+          <w:p>
+            <w:r>
+              <w:t>The system shall let anyone add or remove a small stamp on a quote card: the tagline and a QR code that links to the project page.</w:t>
             </w:r>
           </w:p>
         </w:tc>
@@ -2818,6 +3144,154 @@
           </w:p>
         </w:tc>
       </w:tr>
+      <w:tr>
+        <w:tblPrEx>
+          <w:tblCellMar>
+            <w:top w:w="0" w:type="dxa"/>
+            <w:bottom w:w="0" w:type="dxa"/>
+          </w:tblCellMar>
+        </w:tblPrEx>
+        <w:tc>
+          <w:tcPr>
+            <w:tcW w:w="1200" w:type="dxa"/>
+            <w:tcBorders>
+              <w:top w:val="single" w:sz="4" w:space="0" w:color="BFBFBF"/>
+              <w:left w:val="single" w:sz="4" w:space="0" w:color="BFBFBF"/>
+              <w:bottom w:val="single" w:sz="4" w:space="0" w:color="BFBFBF"/>
+              <w:right w:val="single" w:sz="4" w:space="0" w:color="BFBFBF"/>
+            </w:tcBorders>
+            <w:tcMar>
+              <w:top w:w="60" w:type="dxa"/>
+              <w:left w:w="100" w:type="dxa"/>
+              <w:bottom w:w="60" w:type="dxa"/>
+              <w:right w:w="100" w:type="dxa"/>
+            </w:tcMar>
+          </w:tcPr>
+          <w:p>
+            <w:r>
+              <w:t>NFR-09</w:t>
+            </w:r>
+          </w:p>
+        </w:tc>
+        <w:tc>
+          <w:tcPr>
+            <w:tcW w:w="1800" w:type="dxa"/>
+            <w:tcBorders>
+              <w:top w:val="single" w:sz="4" w:space="0" w:color="BFBFBF"/>
+              <w:left w:val="single" w:sz="4" w:space="0" w:color="BFBFBF"/>
+              <w:bottom w:val="single" w:sz="4" w:space="0" w:color="BFBFBF"/>
+              <w:right w:val="single" w:sz="4" w:space="0" w:color="BFBFBF"/>
+            </w:tcBorders>
+            <w:tcMar>
+              <w:top w:w="60" w:type="dxa"/>
+              <w:left w:w="100" w:type="dxa"/>
+              <w:bottom w:w="60" w:type="dxa"/>
+              <w:right w:w="100" w:type="dxa"/>
+            </w:tcMar>
+          </w:tcPr>
+          <w:p>
+            <w:r>
+              <w:t>Usability</w:t>
+            </w:r>
+          </w:p>
+        </w:tc>
+        <w:tc>
+          <w:tcPr>
+            <w:tcW w:w="6026" w:type="dxa"/>
+            <w:tcBorders>
+              <w:top w:val="single" w:sz="4" w:space="0" w:color="BFBFBF"/>
+              <w:left w:val="single" w:sz="4" w:space="0" w:color="BFBFBF"/>
+              <w:bottom w:val="single" w:sz="4" w:space="0" w:color="BFBFBF"/>
+              <w:right w:val="single" w:sz="4" w:space="0" w:color="BFBFBF"/>
+            </w:tcBorders>
+            <w:tcMar>
+              <w:top w:w="60" w:type="dxa"/>
+              <w:left w:w="100" w:type="dxa"/>
+              <w:bottom w:w="60" w:type="dxa"/>
+              <w:right w:w="100" w:type="dxa"/>
+            </w:tcMar>
+          </w:tcPr>
+          <w:p>
+            <w:r>
+              <w:t>The pages shall fit phone screens without sideways scrolling, and moving parts shall use short, soft animations.</w:t>
+            </w:r>
+          </w:p>
+        </w:tc>
+      </w:tr>
+      <w:tr>
+        <w:tblPrEx>
+          <w:tblCellMar>
+            <w:top w:w="0" w:type="dxa"/>
+            <w:bottom w:w="0" w:type="dxa"/>
+          </w:tblCellMar>
+        </w:tblPrEx>
+        <w:tc>
+          <w:tcPr>
+            <w:tcW w:w="1200" w:type="dxa"/>
+            <w:tcBorders>
+              <w:top w:val="single" w:sz="4" w:space="0" w:color="BFBFBF"/>
+              <w:left w:val="single" w:sz="4" w:space="0" w:color="BFBFBF"/>
+              <w:bottom w:val="single" w:sz="4" w:space="0" w:color="BFBFBF"/>
+              <w:right w:val="single" w:sz="4" w:space="0" w:color="BFBFBF"/>
+            </w:tcBorders>
+            <w:tcMar>
+              <w:top w:w="60" w:type="dxa"/>
+              <w:left w:w="100" w:type="dxa"/>
+              <w:bottom w:w="60" w:type="dxa"/>
+              <w:right w:w="100" w:type="dxa"/>
+            </w:tcMar>
+          </w:tcPr>
+          <w:p>
+            <w:r>
+              <w:t>NFR-10</w:t>
+            </w:r>
+          </w:p>
+        </w:tc>
+        <w:tc>
+          <w:tcPr>
+            <w:tcW w:w="1800" w:type="dxa"/>
+            <w:tcBorders>
+              <w:top w:val="single" w:sz="4" w:space="0" w:color="BFBFBF"/>
+              <w:left w:val="single" w:sz="4" w:space="0" w:color="BFBFBF"/>
+              <w:bottom w:val="single" w:sz="4" w:space="0" w:color="BFBFBF"/>
+              <w:right w:val="single" w:sz="4" w:space="0" w:color="BFBFBF"/>
+            </w:tcBorders>
+            <w:tcMar>
+              <w:top w:w="60" w:type="dxa"/>
+              <w:left w:w="100" w:type="dxa"/>
+              <w:bottom w:w="60" w:type="dxa"/>
+              <w:right w:w="100" w:type="dxa"/>
+            </w:tcMar>
+          </w:tcPr>
+          <w:p>
+            <w:r>
+              <w:t>Maintainability</w:t>
+            </w:r>
+          </w:p>
+        </w:tc>
+        <w:tc>
+          <w:tcPr>
+            <w:tcW w:w="6026" w:type="dxa"/>
+            <w:tcBorders>
+              <w:top w:val="single" w:sz="4" w:space="0" w:color="BFBFBF"/>
+              <w:left w:val="single" w:sz="4" w:space="0" w:color="BFBFBF"/>
+              <w:bottom w:val="single" w:sz="4" w:space="0" w:color="BFBFBF"/>
+              <w:right w:val="single" w:sz="4" w:space="0" w:color="BFBFBF"/>
+            </w:tcBorders>
+            <w:tcMar>
+              <w:top w:w="60" w:type="dxa"/>
+              <w:left w:w="100" w:type="dxa"/>
+              <w:bottom w:w="60" w:type="dxa"/>
+              <w:right w:w="100" w:type="dxa"/>
+            </w:tcMar>
+          </w:tcPr>
+          <w:p>
+            <w:r>
+              <w:t>The main features shall be covered by automated tests that run with one command (php artisan test).</w:t>
+            </w:r>
+          </w:p>
+        </w:tc>
+      </w:tr>
     </w:tbl>
     <w:p>
       <w:pPr>
@@ -3236,6 +3710,19 @@
         <w:spacing w:after="60"/>
       </w:pPr>
       <w:r>
+        <w:t>The edit form also has a mood list, and a quote cannot be saved without a mood.</w:t>
+      </w:r>
+    </w:p>
+    <w:p>
+      <w:pPr>
+        <w:pStyle w:val="a4"/>
+        <w:numPr>
+          <w:ilvl w:val="0"/>
+          <w:numId w:val="2"/>
+        </w:numPr>
+        <w:spacing w:after="60"/>
+      </w:pPr>
+      <w:r>
         <w:t>When I press Cancel, then the quote stays as it was.</w:t>
       </w:r>
     </w:p>
@@ -3558,6 +4045,19 @@
         <w:spacing w:after="60"/>
       </w:pPr>
       <w:r>
+        <w:t>When the stamp option is on, then the card shows the tagline and a QR code; when it is off, they are hidden.</w:t>
+      </w:r>
+    </w:p>
+    <w:p>
+      <w:pPr>
+        <w:pStyle w:val="a4"/>
+        <w:numPr>
+          <w:ilvl w:val="0"/>
+          <w:numId w:val="2"/>
+        </w:numPr>
+        <w:spacing w:after="60"/>
+      </w:pPr>
+      <w:r>
         <w:t>When I press Download PNG, then an image file of the card is saved to my device.</w:t>
       </w:r>
     </w:p>
@@ -3626,6 +4126,153 @@
       </w:pPr>
       <w:r>
         <w:t>When I press Esc or the close button, then I return to the quotes page.</w:t>
+      </w:r>
+    </w:p>
+    <w:p>
+      <w:pPr>
+        <w:spacing w:before="200" w:after="80"/>
+      </w:pPr>
+      <w:r>
+        <w:rPr>
+          <w:b/>
+          <w:bCs/>
+        </w:rPr>
+        <w:t>US-13 — Save a quote to My Insights (FR-14)</w:t>
+      </w:r>
+    </w:p>
+    <w:p>
+      <w:pPr>
+        <w:spacing w:after="120"/>
+        <w:rPr>
+          <w:i/>
+          <w:iCs/>
+        </w:rPr>
+      </w:pPr>
+      <w:r>
+        <w:rPr>
+          <w:i/>
+          <w:iCs/>
+        </w:rPr>
+        <w:t>As a registered user, I want to save quotes I like, so that I can find them again on my own page.</w:t>
+      </w:r>
+    </w:p>
+    <w:p>
+      <w:pPr>
+        <w:pStyle w:val="a4"/>
+        <w:numPr>
+          <w:ilvl w:val="0"/>
+          <w:numId w:val="2"/>
+        </w:numPr>
+        <w:spacing w:after="60"/>
+      </w:pPr>
+      <w:r>
+        <w:t>When I press Save under a quote, then the button changes to Saved and the quote appears on My Insights.</w:t>
+      </w:r>
+    </w:p>
+    <w:p>
+      <w:pPr>
+        <w:pStyle w:val="a4"/>
+        <w:numPr>
+          <w:ilvl w:val="0"/>
+          <w:numId w:val="2"/>
+        </w:numPr>
+        <w:spacing w:after="60"/>
+      </w:pPr>
+      <w:r>
+        <w:t>When I press Saved again, then the quote is removed from My Insights.</w:t>
+      </w:r>
+    </w:p>
+    <w:p>
+      <w:pPr>
+        <w:pStyle w:val="a4"/>
+        <w:numPr>
+          <w:ilvl w:val="0"/>
+          <w:numId w:val="2"/>
+        </w:numPr>
+        <w:spacing w:after="60"/>
+      </w:pPr>
+      <w:r>
+        <w:t>When I open My Insights, then I see only the quotes I saved; if there are none, I see a short message.</w:t>
+      </w:r>
+    </w:p>
+    <w:p>
+      <w:pPr>
+        <w:pStyle w:val="a4"/>
+        <w:numPr>
+          <w:ilvl w:val="0"/>
+          <w:numId w:val="2"/>
+        </w:numPr>
+        <w:spacing w:after="60"/>
+      </w:pPr>
+      <w:r>
+        <w:t>As a guest, I do not see the Save button.</w:t>
+      </w:r>
+    </w:p>
+    <w:p>
+      <w:pPr>
+        <w:spacing w:before="200" w:after="80"/>
+      </w:pPr>
+      <w:r>
+        <w:rPr>
+          <w:b/>
+          <w:bCs/>
+        </w:rPr>
+        <w:t>US-14 — Search quotes (FR-15)</w:t>
+      </w:r>
+    </w:p>
+    <w:p>
+      <w:pPr>
+        <w:spacing w:after="120"/>
+        <w:rPr>
+          <w:i/>
+          <w:iCs/>
+        </w:rPr>
+      </w:pPr>
+      <w:r>
+        <w:rPr>
+          <w:i/>
+          <w:iCs/>
+        </w:rPr>
+        <w:t>As a user, I want to search the quotes, so that I can quickly find a quote or an author.</w:t>
+      </w:r>
+    </w:p>
+    <w:p>
+      <w:pPr>
+        <w:pStyle w:val="a4"/>
+        <w:numPr>
+          <w:ilvl w:val="0"/>
+          <w:numId w:val="2"/>
+        </w:numPr>
+        <w:spacing w:after="60"/>
+      </w:pPr>
+      <w:r>
+        <w:t>When I type a word in the search box, then only quotes with that word in the text or the author name stay on the page, without reloading.</w:t>
+      </w:r>
+    </w:p>
+    <w:p>
+      <w:pPr>
+        <w:pStyle w:val="a4"/>
+        <w:numPr>
+          <w:ilvl w:val="0"/>
+          <w:numId w:val="2"/>
+        </w:numPr>
+        <w:spacing w:after="60"/>
+      </w:pPr>
+      <w:r>
+        <w:t>When I also pick a mood, then only quotes that match both are shown.</w:t>
+      </w:r>
+    </w:p>
+    <w:p>
+      <w:pPr>
+        <w:pStyle w:val="a4"/>
+        <w:numPr>
+          <w:ilvl w:val="0"/>
+          <w:numId w:val="2"/>
+        </w:numPr>
+        <w:spacing w:after="60"/>
+      </w:pPr>
+      <w:r>
+        <w:t>When I clear the box, then all quotes (of the chosen mood) are shown again.</w:t>
       </w:r>
     </w:p>
     <w:p>
@@ -3648,7 +4295,7 @@
         <w:lastRenderedPageBreak/>
         <w:drawing>
           <wp:inline distT="0" distB="0" distL="0" distR="0" wp14:anchorId="2AD6BCFC" wp14:editId="0B1CDF6D">
-            <wp:extent cx="5334000" cy="4930098"/>
+            <wp:extent cx="5334000" cy="5596327"/>
             <wp:effectExtent l="0" t="0" r="0" b="0"/>
             <wp:docPr id="1" name="صورة 1"/>
             <wp:cNvGraphicFramePr>
@@ -3673,7 +4320,7 @@
                   <pic:spPr bwMode="auto">
                     <a:xfrm>
                       <a:off x="0" y="0"/>
-                      <a:ext cx="5334000" cy="4930098"/>
+                      <a:ext cx="5334000" cy="5596327"/>
                     </a:xfrm>
                     <a:prstGeom prst="rect">
                       <a:avLst/>
@@ -3691,7 +4338,7 @@
         <w:spacing w:after="120"/>
       </w:pPr>
       <w:r>
-        <w:t>A guest can view all quotes, filter them by mood, see the Insight of the Day, make quote cards, start a calm session, sign up, and log in. A registered user can do everything a guest can, plus log out, share quotes, like or unlike any quote, and edit or delete their own. Sharing a quote is the core use case.</w:t>
+        <w:t>A guest can view all quotes, search them, filter them by mood, see the Insight of the Day, make quote cards, start a calm session, sign up, and log in. A registered user can do everything a guest can, plus log out, share quotes, like or unlike any quote, save quotes to My Insights, and edit or delete their own. Sharing a quote is the core use case.</w:t>
       </w:r>
     </w:p>
     <w:p>
@@ -3906,7 +4553,7 @@
         <w:spacing w:after="60"/>
       </w:pPr>
       <w:r>
-        <w:t>Each quote has one mood: Hope, Calm, Philosophy, or Motivation. Quotes shared before moods existed have no mood.</w:t>
+        <w:t>Each quote has one mood: Hope, Calm, Philosophy, or Motivation. Quotes shared before moods existed have no mood until their owner edits them.</w:t>
       </w:r>
     </w:p>
     <w:p>
@@ -3920,6 +4567,19 @@
       </w:pPr>
       <w:r>
         <w:t>The Insight of the Day is picked once per day and kept for that day, so all visitors see the same quote.</w:t>
+      </w:r>
+    </w:p>
+    <w:p>
+      <w:pPr>
+        <w:pStyle w:val="a4"/>
+        <w:numPr>
+          <w:ilvl w:val="0"/>
+          <w:numId w:val="2"/>
+        </w:numPr>
+        <w:spacing w:after="60"/>
+      </w:pPr>
+      <w:r>
+        <w:t>The quote card image is made in the user's browser, so no image is sent to or stored on the server.</w:t>
       </w:r>
     </w:p>
     <w:sectPr>

</xml_diff>

<commit_message>
Final SRS with Blade constraint
</commit_message>
<xml_diff>
--- a/docs/QuoteIt_SRS.docx
+++ b/docs/QuoteIt_SRS.docx
@@ -4515,6 +4515,19 @@
       </w:pPr>
       <w:r>
         <w:t>The system is built with Laravel (PHP) and a MySQL database, using Laravel Breeze for sign up and log in, and Alpine.js with Tailwind CSS for the interface.</w:t>
+      </w:r>
+    </w:p>
+    <w:p>
+      <w:pPr>
+        <w:pStyle w:val="a4"/>
+        <w:numPr>
+          <w:ilvl w:val="0"/>
+          <w:numId w:val="2"/>
+        </w:numPr>
+        <w:spacing w:after="60"/>
+      </w:pPr>
+      <w:r>
+        <w:t>All pages extend one shared Blade layout (@extends and @yield) and use reusable Blade components for repeated parts (the navigation bar, the quote card, and the pop-up windows).</w:t>
       </w:r>
     </w:p>
     <w:p>

</xml_diff>